<commit_message>
phase6: cleanup pass - patch i/j leak in phase5 study scripts, refresh portfolio docs (md + docx) with Phase 6 numbers + retraction note, tighten clean-lap filter to within 5 percent of fastest
</commit_message>
<xml_diff>
--- a/06_reports/n24_portfolio_summary.docx
+++ b/06_reports/n24_portfolio_summary.docx
@@ -556,7 +556,7 @@
                 <w:b w:val="false"/>
                 <w:bCs w:val="false"/>
               </w:rPr>
-              <w:t xml:space="preserve">8:10.539</w:t>
+              <w:t xml:space="preserve">8:11.521</w:t>
             </w:r>
           </w:p>
         </w:tc>
@@ -610,7 +610,7 @@
                 <w:b w:val="false"/>
                 <w:bCs w:val="false"/>
               </w:rPr>
-              <w:t xml:space="preserve">-0.16% (-0.80 s)</w:t>
+              <w:t xml:space="preserve">+0.04% (+0.18 s)</w:t>
             </w:r>
           </w:p>
         </w:tc>
@@ -719,6 +719,60 @@
                 <w:bCs w:val="false"/>
               </w:rPr>
               <w:t xml:space="preserve">PASS</w:t>
+            </w:r>
+          </w:p>
+        </w:tc>
+      </w:tr>
+      <w:tr>
+        <w:tc>
+          <w:tcPr>
+            <w:tcW w:type="dxa" w:w="3120"/>
+            <w:tcBorders>
+              <w:top w:val="single" w:color="BFBFBF" w:sz="4"/>
+              <w:left w:val="single" w:color="BFBFBF" w:sz="4"/>
+              <w:bottom w:val="single" w:color="BFBFBF" w:sz="4"/>
+              <w:right w:val="single" w:color="BFBFBF" w:sz="4"/>
+            </w:tcBorders>
+            <w:tcMar>
+              <w:top w:type="dxa" w:w="80"/>
+              <w:left w:type="dxa" w:w="120"/>
+              <w:bottom w:type="dxa" w:w="80"/>
+              <w:right w:type="dxa" w:w="120"/>
+            </w:tcMar>
+          </w:tcPr>
+          <w:p>
+            <w:r>
+              <w:rPr>
+                <w:b w:val="false"/>
+                <w:bCs w:val="false"/>
+              </w:rPr>
+              <w:t xml:space="preserve">Calibrated against</w:t>
+            </w:r>
+          </w:p>
+        </w:tc>
+        <w:tc>
+          <w:tcPr>
+            <w:tcW w:type="dxa" w:w="6240"/>
+            <w:tcBorders>
+              <w:top w:val="single" w:color="BFBFBF" w:sz="4"/>
+              <w:left w:val="single" w:color="BFBFBF" w:sz="4"/>
+              <w:bottom w:val="single" w:color="BFBFBF" w:sz="4"/>
+              <w:right w:val="single" w:color="BFBFBF" w:sz="4"/>
+            </w:tcBorders>
+            <w:tcMar>
+              <w:top w:type="dxa" w:w="80"/>
+              <w:left w:type="dxa" w:w="120"/>
+              <w:bottom w:type="dxa" w:w="80"/>
+              <w:right w:type="dxa" w:w="120"/>
+            </w:tcMar>
+          </w:tcPr>
+          <w:p>
+            <w:r>
+              <w:rPr>
+                <w:b w:val="false"/>
+                <w:bCs w:val="false"/>
+              </w:rPr>
+              <w:t xml:space="preserve">Multi-lap iRacing IBT (Phase 6)</w:t>
             </w:r>
           </w:p>
         </w:tc>
@@ -2425,7 +2479,7 @@
                 <w:b w:val="false"/>
                 <w:bCs w:val="false"/>
               </w:rPr>
-              <w:t xml:space="preserve">v05 calibrated</w:t>
+              <w:t xml:space="preserve">v05 calibrated (Phase 6, IBT)</w:t>
             </w:r>
           </w:p>
         </w:tc>
@@ -2451,7 +2505,7 @@
                 <w:b w:val="false"/>
                 <w:bCs w:val="false"/>
               </w:rPr>
-              <w:t xml:space="preserve">8:10.539</w:t>
+              <w:t xml:space="preserve">8:11.521</w:t>
             </w:r>
           </w:p>
         </w:tc>
@@ -2477,7 +2531,7 @@
                 <w:b w:val="false"/>
                 <w:bCs w:val="false"/>
               </w:rPr>
-              <w:t xml:space="preserve">-0.80 s (-0.16 %)</w:t>
+              <w:t xml:space="preserve">+0.18 s (+0.04 %)</w:t>
             </w:r>
           </w:p>
         </w:tc>
@@ -2547,7 +2601,7 @@
           <wp:inline distT="0" distB="0" distL="0" distR="0">
             <wp:extent cx="5143500" cy="2162175"/>
             <wp:effectExtent t="0" r="0" b="0" l="0"/>
-            <wp:docPr id="1" name="fig_calibration_heatmap.png" descr="Figure 2 — Step 4 calibration heatmap. Optimum at mu_0 = 1.70, load_sens_k = 4.4×10⁻⁵." title="Figure 2 — Step 4 calibration heatmap. Optimum at mu_0 = 1.70, load_sens_k = 4.4×10⁻⁵."/>
+            <wp:docPr id="1" name="fig_calibration_heatmap.png" descr="Figure 2 — Step 4 calibration heatmap (figure pre-dates Phase 6 bug-fix; structure of the valley is the same)." title="Figure 2 — Step 4 calibration heatmap (figure pre-dates Phase 6 bug-fix; structure of the valley is the same)."/>
             <wp:cNvGraphicFramePr>
               <a:graphicFrameLocks xmlns:a="http://schemas.openxmlformats.org/drawingml/2006/main" noChangeAspect="1"/>
             </wp:cNvGraphicFramePr>
@@ -2595,7 +2649,7 @@
           <w:sz w:val="20"/>
           <w:szCs w:val="20"/>
         </w:rPr>
-        <w:t xml:space="preserve">Figure 2 — Step 4 calibration heatmap. Optimum at mu_0 = 1.70, load_sens_k = 4.4×10⁻⁵.</w:t>
+        <w:t xml:space="preserve">Figure 2 — Step 4 calibration heatmap (figure pre-dates Phase 6 bug-fix; structure of the valley is the same).</w:t>
       </w:r>
     </w:p>
     <w:p>
@@ -2603,10 +2657,43 @@
         <w:spacing w:after="120"/>
       </w:pPr>
       <w:r>
-        <w:t xml:space="preserve">The optimum landed at mu_0 = 1.70 and load_sens_k = 4.4 × 10⁻⁵. Both [EST] flags in the pre-calibration </w:t>
-      </w:r>
-      <w:r>
-        <w:t xml:space="preserve">parameter file are now replaced with [CAL] and a provenance comment block citing the entry that produced them.</w:t>
+        <w:t xml:space="preserve">The Phase 6 optimum (post-bug-fix) landed at mu_0 = 1.75 and load_sens_k = 5.5 × 10⁻⁵, the interior cell of a flat diagonal valley five cells wide. </w:t>
+      </w:r>
+      <w:r>
+        <w:t xml:space="preserve">The two parameters trade off — higher baseline μ with steeper load drop equates to lower baseline μ with flatter drop at race-load Fz — so the calibration </w:t>
+      </w:r>
+      <w:r>
+        <w:t xml:space="preserve">sits in a valley rather than a single sharp minimum. We pick the interior cell over the edge cell as the more defensible point estimate. Both [EST] flags </w:t>
+      </w:r>
+      <w:r>
+        <w:t xml:space="preserve">are now [CAL] with a provenance comment block citing logbook Entry 020.</w:t>
+      </w:r>
+    </w:p>
+    <w:p>
+      <w:pPr>
+        <w:spacing w:after="120"/>
+      </w:pPr>
+      <w:r>
+        <w:rPr>
+          <w:b/>
+          <w:bCs/>
+        </w:rPr>
+        <w:t xml:space="preserve">Retraction (added 2026-04-21). </w:t>
+      </w:r>
+      <w:r>
+        <w:t xml:space="preserve">A previous version of this document reported mu_0 = 1.70, load_sens_k = 4.4e-5, calibrated against a single-lap PI Toolbox .xls export (Phase 5). </w:t>
+      </w:r>
+      <w:r>
+        <w:t xml:space="preserve">That result was contaminated by a workspace-leak bug: the v05 solver leaks loop counters i and j through MATLAB evalc(), which caused 24 of 25 grid cells </w:t>
+      </w:r>
+      <w:r>
+        <w:t xml:space="preserve">to never be written; the reported best was the first-zero index. The cell happened to sit at the lower-grip corner of the same flat valley, so the lap </w:t>
+      </w:r>
+      <w:r>
+        <w:t xml:space="preserve">was directionally correct, but the result was not the validated minimum the report claimed. Phase 6 fixes the bug, re-runs the sweep against a multi-lap </w:t>
+      </w:r>
+      <w:r>
+        <w:t xml:space="preserve">IBT-derived reference, and supersedes the Phase 5 numbers with mu_0 = 1.75, load_sens_k = 5.5e-5. The charter still passes (now at +0.04 percent).</w:t>
       </w:r>
     </w:p>
     <w:p>

</xml_diff>